<commit_message>
Role A figurlerini yeniden adlandir (gorsel cache-bust: k=1000 surumu inline gozuksun)
Co-Authored-By: Claude Opus 4.8 <noreply@anthropic.com>
Claude-Session: https://claude.ai/code/session_012CynvYfne529gNCKSE4Z77
</commit_message>
<xml_diff>
--- a/REPORT.docx
+++ b/REPORT.docx
@@ -777,7 +777,7 @@
               <a:graphicData uri="http://schemas.openxmlformats.org/drawingml/2006/picture">
                 <pic:pic>
                   <pic:nvPicPr>
-                    <pic:cNvPr descr="figures/curves_methods_600k_cost.png" id="13" name="Picture"/>
+                    <pic:cNvPr descr="figures/dqn_family_600k_cost.png" id="13" name="Picture"/>
                     <pic:cNvPicPr>
                       <a:picLocks noChangeArrowheads="1" noChangeAspect="1"/>
                     </pic:cNvPicPr>
@@ -832,7 +832,7 @@
               <a:graphicData uri="http://schemas.openxmlformats.org/drawingml/2006/picture">
                 <pic:pic>
                   <pic:nvPicPr>
-                    <pic:cNvPr descr="figures/curves_methods_600k_return.png" id="16" name="Picture"/>
+                    <pic:cNvPr descr="figures/dqn_family_600k_return.png" id="16" name="Picture"/>
                     <pic:cNvPicPr>
                       <a:picLocks noChangeArrowheads="1" noChangeAspect="1"/>
                     </pic:cNvPicPr>
@@ -963,7 +963,7 @@
               <a:graphicData uri="http://schemas.openxmlformats.org/drawingml/2006/picture">
                 <pic:pic>
                   <pic:nvPicPr>
-                    <pic:cNvPr descr="figures/curves_double_3m_cost.png" id="19" name="Picture"/>
+                    <pic:cNvPr descr="figures/double_dqn_3m_cost.png" id="19" name="Picture"/>
                     <pic:cNvPicPr>
                       <a:picLocks noChangeArrowheads="1" noChangeAspect="1"/>
                     </pic:cNvPicPr>

</xml_diff>